<commit_message>
docs: use Option A (pure docker pull) and add conceptual Cloud VPS deployment guide
</commit_message>
<xml_diff>
--- a/homework/Homework-Docker-3Containers-Complete.docx
+++ b/homework/Homework-Docker-3Containers-Complete.docx
@@ -732,62 +732,62 @@
         </w:r>
       </w:hyperlink>
     </w:p>
-    <w:tbl>
-      <w:tblPr>
-        <w:tblW w:type="auto" w:w="0"/>
-        <w:jc w:val="center"/>
-        <w:tblLook w:firstColumn="1" w:firstRow="1" w:lastColumn="0" w:lastRow="0" w:noHBand="0" w:noVBand="1" w:val="04A0"/>
-      </w:tblPr>
-      <w:tblGrid>
-        <w:gridCol w:w="10080"/>
-      </w:tblGrid>
-      <w:tr>
-        <w:tc>
-          <w:tcPr>
-            <w:tcW w:type="dxa" w:w="9792"/>
-            <w:vAlign w:val="center"/>
-            <w:shd w:fill="F8FAFC"/>
-            <w:tcBorders>
-              <w:top w:val="dashed" w:sz="8" w:space="0" w:color="94A3B8"/>
-              <w:left w:val="dashed" w:sz="8" w:space="0" w:color="94A3B8"/>
-              <w:bottom w:val="dashed" w:sz="8" w:space="0" w:color="94A3B8"/>
-              <w:right w:val="dashed" w:sz="8" w:space="0" w:color="94A3B8"/>
-            </w:tcBorders>
-          </w:tcPr>
-          <w:p>
-            <w:pPr>
-              <w:spacing w:before="440" w:after="440"/>
-              <w:jc w:val="center"/>
-            </w:pPr>
-            <w:r>
-              <w:rPr>
-                <w:rFonts w:ascii="Calibri" w:hAnsi="Calibri"/>
-                <w:b/>
-                <w:i w:val="0"/>
-                <w:color w:val="1679AB"/>
-                <w:sz w:val="22"/>
-              </w:rPr>
-              <w:t>📷 [ PASTE SCREENSHOT HERE ]</w:t>
-              <w:br/>
-            </w:r>
-            <w:r>
-              <w:rPr>
-                <w:rFonts w:ascii="Calibri" w:hAnsi="Calibri"/>
-                <w:b w:val="0"/>
-                <w:i/>
-                <w:color w:val="64748B"/>
-                <w:sz w:val="19"/>
-              </w:rPr>
-              <w:t>Screenshot 5: Docker Hub Repositories Page (showing all 3 containers)</w:t>
-            </w:r>
-          </w:p>
-        </w:tc>
-      </w:tr>
-    </w:tbl>
     <w:p>
       <w:pPr>
-        <w:spacing w:after="80"/>
+        <w:spacing w:before="120" w:after="40"/>
+        <w:jc w:val="center"/>
       </w:pPr>
+    </w:p>
+    <w:p>
+      <w:r>
+        <w:drawing>
+          <wp:inline xmlns:a="http://schemas.openxmlformats.org/drawingml/2006/main" xmlns:pic="http://schemas.openxmlformats.org/drawingml/2006/picture">
+            <wp:extent cx="6035040" cy="3341668"/>
+            <wp:docPr id="1" name="Picture 1"/>
+            <wp:cNvGraphicFramePr>
+              <a:graphicFrameLocks noChangeAspect="1"/>
+            </wp:cNvGraphicFramePr>
+            <a:graphic>
+              <a:graphicData uri="http://schemas.openxmlformats.org/drawingml/2006/picture">
+                <pic:pic>
+                  <pic:nvPicPr>
+                    <pic:cNvPr id="0" name="dockerhub-screenshot.png"/>
+                    <pic:cNvPicPr/>
+                  </pic:nvPicPr>
+                  <pic:blipFill>
+                    <a:blip r:embed="rId10"/>
+                    <a:stretch>
+                      <a:fillRect/>
+                    </a:stretch>
+                  </pic:blipFill>
+                  <pic:spPr>
+                    <a:xfrm>
+                      <a:off x="0" y="0"/>
+                      <a:ext cx="6035040" cy="3341668"/>
+                    </a:xfrm>
+                    <a:prstGeom prst="rect"/>
+                  </pic:spPr>
+                </pic:pic>
+              </a:graphicData>
+            </a:graphic>
+          </wp:inline>
+        </w:drawing>
+      </w:r>
+    </w:p>
+    <w:p>
+      <w:pPr>
+        <w:jc w:val="center"/>
+      </w:pPr>
+      <w:r>
+        <w:rPr>
+          <w:rFonts w:ascii="Calibri" w:hAnsi="Calibri"/>
+          <w:b w:val="0"/>
+          <w:i/>
+          <w:color w:val="64748B"/>
+          <w:sz w:val="18"/>
+        </w:rPr>
+        <w:t>Figure 3.1: All 3 Containers Published on Docker Hub under 'lorndavid'</w:t>
+      </w:r>
     </w:p>
     <w:p>
       <w:pPr>
@@ -801,19 +801,19 @@
           <w:color w:val="0F3460"/>
           <w:sz w:val="26"/>
         </w:rPr>
-        <w:t>4. How to Pull and Run on Any Computer / Docker Desktop</w:t>
+        <w:t>4. How to Pull and Run Directly from Docker Hub (No Git)</w:t>
       </w:r>
     </w:p>
     <w:p>
       <w:r>
         <w:rPr>
           <w:rFonts w:ascii="Calibri" w:hAnsi="Calibri"/>
-          <w:b/>
+          <w:b w:val="0"/>
           <w:i w:val="0"/>
-          <w:color w:val="1679AB"/>
+          <w:color w:val="1E293B"/>
           <w:sz w:val="22"/>
         </w:rPr>
-        <w:t>Method A: Turnkey Execution with Docker Compose (Recommended)</w:t>
+        <w:t>Anyone can pull all 3 containers directly from Docker Hub and run them using standard Docker commands:</w:t>
       </w:r>
     </w:p>
     <w:tbl>
@@ -850,75 +850,7 @@
                 <w:color w:val="1E293B"/>
                 <w:sz w:val="19"/>
               </w:rPr>
-              <w:t># 1. Pull project and run all 3 containers</w:t>
-              <w:br/>
-              <w:t>git clone https://github.com/lorndavid/khmer-data-api.git</w:t>
-              <w:br/>
-              <w:t>cd khmer-data-api</w:t>
-              <w:br/>
-              <w:t>docker compose -f docker-compose.hub.yml up -d</w:t>
-              <w:br/>
-              <w:br/>
-              <w:t># 2. Check running status</w:t>
-              <w:br/>
-              <w:t>docker ps</w:t>
-            </w:r>
-          </w:p>
-        </w:tc>
-      </w:tr>
-    </w:tbl>
-    <w:p>
-      <w:pPr>
-        <w:spacing w:after="40"/>
-      </w:pPr>
-    </w:p>
-    <w:p>
-      <w:r>
-        <w:rPr>
-          <w:rFonts w:ascii="Calibri" w:hAnsi="Calibri"/>
-          <w:b/>
-          <w:i w:val="0"/>
-          <w:color w:val="1679AB"/>
-          <w:sz w:val="22"/>
-        </w:rPr>
-        <w:t>Method B: Manual Execution via Docker Network &amp; CLI (Like Classmate Model):</w:t>
-      </w:r>
-    </w:p>
-    <w:tbl>
-      <w:tblPr>
-        <w:tblW w:type="auto" w:w="0"/>
-        <w:jc w:val="center"/>
-        <w:tblLook w:firstColumn="1" w:firstRow="1" w:lastColumn="0" w:lastRow="0" w:noHBand="0" w:noVBand="1" w:val="04A0"/>
-      </w:tblPr>
-      <w:tblGrid>
-        <w:gridCol w:w="10080"/>
-      </w:tblGrid>
-      <w:tr>
-        <w:tc>
-          <w:tcPr>
-            <w:tcW w:type="dxa" w:w="9792"/>
-            <w:shd w:fill="F1F5F9"/>
-            <w:tcBorders>
-              <w:top w:val="single" w:sz="4" w:space="0" w:color="CBD5E1"/>
-              <w:left w:val="single" w:sz="16" w:space="0" w:color="1679AB"/>
-              <w:bottom w:val="single" w:sz="4" w:space="0" w:color="CBD5E1"/>
-              <w:right w:val="single" w:sz="4" w:space="0" w:color="CBD5E1"/>
-            </w:tcBorders>
-          </w:tcPr>
-          <w:p>
-            <w:pPr>
-              <w:spacing w:before="80" w:after="80"/>
-              <w:ind w:left="144"/>
-            </w:pPr>
-            <w:r>
-              <w:rPr>
-                <w:rFonts w:ascii="Consolas" w:hAnsi="Consolas"/>
-                <w:b w:val="0"/>
-                <w:i w:val="0"/>
-                <w:color w:val="1E293B"/>
-                <w:sz w:val="19"/>
-              </w:rPr>
-              <w:t># 1. Pull all 3 images from Docker Hub</w:t>
+              <w:t># Step 1: Pull all 3 images directly from Docker Hub</w:t>
               <w:br/>
               <w:t>docker pull lorndavid/khmerapi-database:latest</w:t>
               <w:br/>
@@ -927,12 +859,12 @@
               <w:t>docker pull lorndavid/khmerapi-frontend:latest</w:t>
               <w:br/>
               <w:br/>
-              <w:t># 2. Create isolated Docker network</w:t>
+              <w:t># Step 2: Create private Docker network for communication</w:t>
               <w:br/>
               <w:t>docker network create khmerapi-net</w:t>
               <w:br/>
               <w:br/>
-              <w:t># 3. Start Database Container</w:t>
+              <w:t># Step 3: Run Database Container</w:t>
               <w:br/>
               <w:t>docker run -d \</w:t>
               <w:br/>
@@ -951,7 +883,7 @@
               <w:t xml:space="preserve">  lorndavid/khmerapi-database:latest</w:t>
               <w:br/>
               <w:br/>
-              <w:t># 4. Start Backend API Container</w:t>
+              <w:t># Step 4: Run Backend REST API Container</w:t>
               <w:br/>
               <w:t>docker run -d \</w:t>
               <w:br/>
@@ -966,7 +898,7 @@
               <w:t xml:space="preserve">  lorndavid/khmerapi-backend:latest</w:t>
               <w:br/>
               <w:br/>
-              <w:t># 5. Start Frontend Container</w:t>
+              <w:t># Step 5: Run Frontend Web UI Container</w:t>
               <w:br/>
               <w:t>docker run -d \</w:t>
               <w:br/>
@@ -977,6 +909,11 @@
               <w:t xml:space="preserve">  -p 80:80 \</w:t>
               <w:br/>
               <w:t xml:space="preserve">  lorndavid/khmerapi-frontend:latest</w:t>
+              <w:br/>
+              <w:br/>
+              <w:t># Step 6: Verify all 3 containers are running</w:t>
+              <w:br/>
+              <w:t>docker ps</w:t>
             </w:r>
           </w:p>
         </w:tc>
@@ -1056,7 +993,164 @@
           <w:color w:val="0F3460"/>
           <w:sz w:val="26"/>
         </w:rPr>
-        <w:t>5. Testing &amp; Verification</w:t>
+        <w:t>5. Production Deployment Guide (Cloud VPS + Custom Domain)</w:t>
+      </w:r>
+    </w:p>
+    <w:p>
+      <w:r>
+        <w:rPr>
+          <w:rFonts w:ascii="Calibri" w:hAnsi="Calibri"/>
+          <w:b w:val="0"/>
+          <w:i w:val="0"/>
+          <w:color w:val="1E293B"/>
+          <w:sz w:val="22"/>
+        </w:rPr>
+        <w:t>Deploying this containerized architecture to a live public production environment is accomplished through four key pillars:</w:t>
+      </w:r>
+    </w:p>
+    <w:p>
+      <w:pPr>
+        <w:spacing w:after="40"/>
+        <w:ind w:left="288"/>
+      </w:pPr>
+      <w:r>
+        <w:rPr>
+          <w:rFonts w:ascii="Calibri" w:hAnsi="Calibri"/>
+          <w:b/>
+          <w:i w:val="0"/>
+          <w:color w:val="1679AB"/>
+          <w:sz w:val="22"/>
+        </w:rPr>
+        <w:t xml:space="preserve">• 1. Cloud Virtual Private Server (VPS Hosting): </w:t>
+      </w:r>
+      <w:r>
+        <w:rPr>
+          <w:rFonts w:ascii="Calibri" w:hAnsi="Calibri"/>
+          <w:b w:val="0"/>
+          <w:i w:val="0"/>
+          <w:color w:val="1E293B"/>
+          <w:sz w:val="22"/>
+        </w:rPr>
+        <w:t>The application is hosted on a high-availability Ubuntu 24.04 LTS Cloud VPS with a dedicated public IPv4 address (147.93.111.196). A VPS provides 24/7 uptime, isolated compute resources, and runs Docker Engine natively so the containers stay alive continuously independent of any local PC.</w:t>
+      </w:r>
+    </w:p>
+    <w:p>
+      <w:pPr>
+        <w:spacing w:after="40"/>
+        <w:ind w:left="288"/>
+      </w:pPr>
+      <w:r>
+        <w:rPr>
+          <w:rFonts w:ascii="Calibri" w:hAnsi="Calibri"/>
+          <w:b/>
+          <w:i w:val="0"/>
+          <w:color w:val="1679AB"/>
+          <w:sz w:val="22"/>
+        </w:rPr>
+        <w:t xml:space="preserve">• 2. Custom Domain &amp; DNS Mapping: </w:t>
+      </w:r>
+      <w:r>
+        <w:rPr>
+          <w:rFonts w:ascii="Calibri" w:hAnsi="Calibri"/>
+          <w:b w:val="0"/>
+          <w:i w:val="0"/>
+          <w:color w:val="1E293B"/>
+          <w:sz w:val="22"/>
+        </w:rPr>
+        <w:t>A public domain (lorndavid.online) with the subdomain (khmerapi.lorndavid.online) is linked to the server. In the DNS management console, an 'A-Record' is configured pointing 'khmerapi.lorndavid.online' to the VPS IP address. When visitors enter the URL, global DNS servers resolve it directly to the Cloud VPS.</w:t>
+      </w:r>
+    </w:p>
+    <w:p>
+      <w:pPr>
+        <w:spacing w:after="40"/>
+        <w:ind w:left="288"/>
+      </w:pPr>
+      <w:r>
+        <w:rPr>
+          <w:rFonts w:ascii="Calibri" w:hAnsi="Calibri"/>
+          <w:b/>
+          <w:i w:val="0"/>
+          <w:color w:val="1679AB"/>
+          <w:sz w:val="22"/>
+        </w:rPr>
+        <w:t xml:space="preserve">• 3. SSL/TLS Encryption &amp; HTTPS Security: </w:t>
+      </w:r>
+      <w:r>
+        <w:rPr>
+          <w:rFonts w:ascii="Calibri" w:hAnsi="Calibri"/>
+          <w:b w:val="0"/>
+          <w:i w:val="0"/>
+          <w:color w:val="1E293B"/>
+          <w:sz w:val="22"/>
+        </w:rPr>
+        <w:t>All incoming traffic is secured using automatic SSL encryption provided by Cloudflare's global edge network. This forces HTTPS, provides DDoS mitigation, enables HTTP/2 speed improvements, and encrypts all communication between clients and the server without manual certificate renewals.</w:t>
+      </w:r>
+    </w:p>
+    <w:p>
+      <w:pPr>
+        <w:spacing w:after="40"/>
+        <w:ind w:left="288"/>
+      </w:pPr>
+      <w:r>
+        <w:rPr>
+          <w:rFonts w:ascii="Calibri" w:hAnsi="Calibri"/>
+          <w:b/>
+          <w:i w:val="0"/>
+          <w:color w:val="1679AB"/>
+          <w:sz w:val="22"/>
+        </w:rPr>
+        <w:t xml:space="preserve">• 4. Containerized Production Orchestration &amp; Reverse Proxy: </w:t>
+      </w:r>
+      <w:r>
+        <w:rPr>
+          <w:rFonts w:ascii="Calibri" w:hAnsi="Calibri"/>
+          <w:b w:val="0"/>
+          <w:i w:val="0"/>
+          <w:color w:val="1E293B"/>
+          <w:sz w:val="22"/>
+        </w:rPr>
+        <w:t>The VPS pulls the exact 3 images from Docker Hub. The Frontend container binds to public port 80. Internally, Nginx serves the compiled Vue 3 Single Page Application on root paths and acts as a reverse proxy forwarding all API calls from '/v1/' directly to the Backend container across the private Docker network.</w:t>
+      </w:r>
+    </w:p>
+    <w:p>
+      <w:pPr>
+        <w:spacing w:after="40"/>
+        <w:ind w:left="288"/>
+      </w:pPr>
+      <w:r>
+        <w:rPr>
+          <w:rFonts w:ascii="Calibri" w:hAnsi="Calibri"/>
+          <w:b/>
+          <w:i w:val="0"/>
+          <w:color w:val="1679AB"/>
+          <w:sz w:val="22"/>
+        </w:rPr>
+        <w:t xml:space="preserve">• 5. Reliability &amp; Zero Host Dependencies: </w:t>
+      </w:r>
+      <w:r>
+        <w:rPr>
+          <w:rFonts w:ascii="Calibri" w:hAnsi="Calibri"/>
+          <w:b w:val="0"/>
+          <w:i w:val="0"/>
+          <w:color w:val="1E293B"/>
+          <w:sz w:val="22"/>
+        </w:rPr>
+        <w:t>Because all runtime dependencies (Node.js, Prisma, PostgreSQL, Nginx) are encapsulated within Docker images, the VPS host remains clean and secure. Containers run with automated restart policies ('restart: always') ensuring instant self-healing if a service restarts.</w:t>
+      </w:r>
+    </w:p>
+    <w:p>
+      <w:pPr>
+        <w:spacing w:before="160" w:after="40"/>
+      </w:pPr>
+      <w:r>
+        <w:rPr>
+          <w:rFonts w:ascii="Calibri" w:hAnsi="Calibri"/>
+          <w:b/>
+          <w:i w:val="0"/>
+          <w:color w:val="0F3460"/>
+          <w:sz w:val="26"/>
+        </w:rPr>
+        <w:t>6. Testing &amp; Live Verification Links</w:t>
       </w:r>
     </w:p>
     <w:p>
@@ -1068,9 +1162,9 @@
           <w:color w:val="1E293B"/>
           <w:sz w:val="22"/>
         </w:rPr>
-        <w:t xml:space="preserve">• Frontend Web UI: </w:t>
+        <w:t xml:space="preserve">• Local Frontend Web UI: </w:t>
       </w:r>
-      <w:hyperlink r:id="rId10" w:history="1">
+      <w:hyperlink r:id="rId11" w:history="1">
         <w:r>
           <w:rPr>
             <w:color w:val="1679AB"/>
@@ -1088,9 +1182,9 @@
           <w:sz w:val="22"/>
         </w:rPr>
         <w:br/>
-        <w:t xml:space="preserve">• REST API All Provinces: </w:t>
+        <w:t xml:space="preserve">• Local REST API All Provinces: </w:t>
       </w:r>
-      <w:hyperlink r:id="rId11" w:history="1">
+      <w:hyperlink r:id="rId12" w:history="1">
         <w:r>
           <w:rPr>
             <w:color w:val="1679AB"/>
@@ -1108,9 +1202,9 @@
           <w:sz w:val="22"/>
         </w:rPr>
         <w:br/>
-        <w:t xml:space="preserve">• Backend Health Check: </w:t>
+        <w:t xml:space="preserve">• Local Backend Health Check: </w:t>
       </w:r>
-      <w:hyperlink r:id="rId12" w:history="1">
+      <w:hyperlink r:id="rId13" w:history="1">
         <w:r>
           <w:rPr>
             <w:color w:val="1679AB"/>
@@ -1128,15 +1222,35 @@
           <w:sz w:val="22"/>
         </w:rPr>
         <w:br/>
-        <w:t xml:space="preserve">• Live Cloud Domain: </w:t>
+        <w:t xml:space="preserve">• Live Production Web Application: </w:t>
       </w:r>
-      <w:hyperlink r:id="rId13" w:history="1">
+      <w:hyperlink r:id="rId14" w:history="1">
         <w:r>
           <w:rPr>
             <w:color w:val="1679AB"/>
             <w:u w:val="single"/>
           </w:rPr>
           <w:t>https://khmerapi.lorndavid.online</w:t>
+        </w:r>
+      </w:hyperlink>
+      <w:r>
+        <w:rPr>
+          <w:rFonts w:ascii="Calibri" w:hAnsi="Calibri"/>
+          <w:b/>
+          <w:i w:val="0"/>
+          <w:color w:val="1E293B"/>
+          <w:sz w:val="22"/>
+        </w:rPr>
+        <w:br/>
+        <w:t xml:space="preserve">• Live Production REST API: </w:t>
+      </w:r>
+      <w:hyperlink r:id="rId15" w:history="1">
+        <w:r>
+          <w:rPr>
+            <w:color w:val="1679AB"/>
+            <w:u w:val="single"/>
+          </w:rPr>
+          <w:t>https://khmerapi.lorndavid.online/v1/provinces</w:t>
         </w:r>
       </w:hyperlink>
     </w:p>

</xml_diff>